<commit_message>
PDD PORTAL FAKE GIT FLOW
</commit_message>
<xml_diff>
--- a/hyperautomation/Semana02_Hyperautomation/PDD_PortalFake_KauaSalesViana.docx
+++ b/hyperautomation/Semana02_Hyperautomation/PDD_PortalFake_KauaSalesViana.docx
@@ -833,7 +833,7 @@
           </mc:Choice>
           <mc:Fallback>
             <w:pict>
-              <v:shape w14:anchorId="6EEBB28E" id="Graphic 2" o:spid="_x0000_s1026" style="position:absolute;margin-left:76.85pt;margin-top:42.95pt;width:441.55pt;height:1.5pt;z-index:15727616;visibility:visible;mso-wrap-style:square;mso-wrap-distance-left:0;mso-wrap-distance-top:0;mso-wrap-distance-right:0;mso-wrap-distance-bottom:0;mso-position-horizontal:absolute;mso-position-horizontal-relative:page;mso-position-vertical:absolute;mso-position-vertical-relative:text;v-text-anchor:top" coordsize="5607685,19050" o:gfxdata="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" path="m5607600,19050l,19050,,,5607600,r,19050xe" fillcolor="#1a3a59" stroked="f">
+              <v:shape w14:anchorId="381FE99E" id="Graphic 2" o:spid="_x0000_s1026" style="position:absolute;margin-left:76.85pt;margin-top:42.95pt;width:441.55pt;height:1.5pt;z-index:15727616;visibility:visible;mso-wrap-style:square;mso-wrap-distance-left:0;mso-wrap-distance-top:0;mso-wrap-distance-right:0;mso-wrap-distance-bottom:0;mso-position-horizontal:absolute;mso-position-horizontal-relative:page;mso-position-vertical:absolute;mso-position-vertical-relative:text;v-text-anchor:top" coordsize="5607685,19050" o:gfxdata="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" path="m5607600,19050l,19050,,,5607600,r,19050xe" fillcolor="#1a3a59" stroked="f">
                 <v:path arrowok="t"/>
                 <w10:wrap anchorx="page"/>
               </v:shape>
@@ -2849,7 +2849,7 @@
           </mc:Choice>
           <mc:Fallback>
             <w:pict>
-              <v:shape w14:anchorId="3715705B" id="Graphic 3" o:spid="_x0000_s1026" style="position:absolute;margin-left:76.85pt;margin-top:8.3pt;width:441.55pt;height:1.5pt;z-index:-251640320;visibility:visible;mso-wrap-style:square;mso-wrap-distance-left:0;mso-wrap-distance-top:0;mso-wrap-distance-right:0;mso-wrap-distance-bottom:0;mso-position-horizontal:absolute;mso-position-horizontal-relative:page;mso-position-vertical:absolute;mso-position-vertical-relative:text;v-text-anchor:top" coordsize="5607685,19050" o:gfxdata="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" path="m5607600,19050l,19050,,,5607600,r,19050xe" fillcolor="#1a3a59" stroked="f">
+              <v:shape w14:anchorId="0C583006" id="Graphic 3" o:spid="_x0000_s1026" style="position:absolute;margin-left:76.85pt;margin-top:8.3pt;width:441.55pt;height:1.5pt;z-index:-251640320;visibility:visible;mso-wrap-style:square;mso-wrap-distance-left:0;mso-wrap-distance-top:0;mso-wrap-distance-right:0;mso-wrap-distance-bottom:0;mso-position-horizontal:absolute;mso-position-horizontal-relative:page;mso-position-vertical:absolute;mso-position-vertical-relative:text;v-text-anchor:top" coordsize="5607685,19050" o:gfxdata="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" path="m5607600,19050l,19050,,,5607600,r,19050xe" fillcolor="#1a3a59" stroked="f">
                 <v:path arrowok="t"/>
                 <w10:wrap type="topAndBottom" anchorx="page"/>
               </v:shape>
@@ -3044,7 +3044,7 @@
           </mc:Choice>
           <mc:Fallback>
             <w:pict>
-              <v:shape w14:anchorId="2CC084B1" id="Graphic 4" o:spid="_x0000_s1026" style="position:absolute;margin-left:76.85pt;margin-top:-3.05pt;width:3.75pt;height:25.6pt;z-index:251633152;visibility:visible;mso-wrap-style:square;mso-wrap-distance-left:0;mso-wrap-distance-top:0;mso-wrap-distance-right:0;mso-wrap-distance-bottom:0;mso-position-horizontal:absolute;mso-position-horizontal-relative:page;mso-position-vertical:absolute;mso-position-vertical-relative:text;v-text-anchor:top" coordsize="47625,325120" o:gfxdata="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" path="m47625,325120l,325120,,,47625,r,325120xe" fillcolor="#2b5282" stroked="f">
+              <v:shape w14:anchorId="12A4D8D8" id="Graphic 4" o:spid="_x0000_s1026" style="position:absolute;margin-left:76.85pt;margin-top:-3.05pt;width:3.75pt;height:25.6pt;z-index:251633152;visibility:visible;mso-wrap-style:square;mso-wrap-distance-left:0;mso-wrap-distance-top:0;mso-wrap-distance-right:0;mso-wrap-distance-bottom:0;mso-position-horizontal:absolute;mso-position-horizontal-relative:page;mso-position-vertical:absolute;mso-position-vertical-relative:text;v-text-anchor:top" coordsize="47625,325120" o:gfxdata="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" path="m47625,325120l,325120,,,47625,r,325120xe" fillcolor="#2b5282" stroked="f">
                 <v:path arrowok="t"/>
                 <w10:wrap anchorx="page"/>
               </v:shape>
@@ -4655,7 +4655,7 @@
           </mc:Choice>
           <mc:Fallback>
             <w:pict>
-              <v:shape w14:anchorId="6D3B0A7E" id="Graphic 5" o:spid="_x0000_s1026" style="position:absolute;margin-left:76.85pt;margin-top:-3.05pt;width:3.75pt;height:25.6pt;z-index:251636224;visibility:visible;mso-wrap-style:square;mso-wrap-distance-left:0;mso-wrap-distance-top:0;mso-wrap-distance-right:0;mso-wrap-distance-bottom:0;mso-position-horizontal:absolute;mso-position-horizontal-relative:page;mso-position-vertical:absolute;mso-position-vertical-relative:text;v-text-anchor:top" coordsize="47625,325120" o:gfxdata="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" path="m47625,325120l,325120,,,47625,r,325120xe" fillcolor="#2b5282" stroked="f">
+              <v:shape w14:anchorId="18864D4B" id="Graphic 5" o:spid="_x0000_s1026" style="position:absolute;margin-left:76.85pt;margin-top:-3.05pt;width:3.75pt;height:25.6pt;z-index:251636224;visibility:visible;mso-wrap-style:square;mso-wrap-distance-left:0;mso-wrap-distance-top:0;mso-wrap-distance-right:0;mso-wrap-distance-bottom:0;mso-position-horizontal:absolute;mso-position-horizontal-relative:page;mso-position-vertical:absolute;mso-position-vertical-relative:text;v-text-anchor:top" coordsize="47625,325120" o:gfxdata="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" path="m47625,325120l,325120,,,47625,r,325120xe" fillcolor="#2b5282" stroked="f">
                 <v:path arrowok="t"/>
                 <w10:wrap anchorx="page"/>
               </v:shape>
@@ -6235,7 +6235,7 @@
           </mc:Choice>
           <mc:Fallback>
             <w:pict>
-              <v:shape w14:anchorId="327EA55F" id="Graphic 6" o:spid="_x0000_s1026" style="position:absolute;margin-left:76.85pt;margin-top:-3.05pt;width:3.75pt;height:25.6pt;z-index:251639296;visibility:visible;mso-wrap-style:square;mso-wrap-distance-left:0;mso-wrap-distance-top:0;mso-wrap-distance-right:0;mso-wrap-distance-bottom:0;mso-position-horizontal:absolute;mso-position-horizontal-relative:page;mso-position-vertical:absolute;mso-position-vertical-relative:text;v-text-anchor:top" coordsize="47625,325120" o:gfxdata="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" path="m47625,325120l,325120,,,47625,r,325120xe" fillcolor="#2b5282" stroked="f">
+              <v:shape w14:anchorId="0D691C97" id="Graphic 6" o:spid="_x0000_s1026" style="position:absolute;margin-left:76.85pt;margin-top:-3.05pt;width:3.75pt;height:25.6pt;z-index:251639296;visibility:visible;mso-wrap-style:square;mso-wrap-distance-left:0;mso-wrap-distance-top:0;mso-wrap-distance-right:0;mso-wrap-distance-bottom:0;mso-position-horizontal:absolute;mso-position-horizontal-relative:page;mso-position-vertical:absolute;mso-position-vertical-relative:text;v-text-anchor:top" coordsize="47625,325120" o:gfxdata="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" path="m47625,325120l,325120,,,47625,r,325120xe" fillcolor="#2b5282" stroked="f">
                 <v:path arrowok="t"/>
                 <w10:wrap anchorx="page"/>
               </v:shape>
@@ -7132,7 +7132,7 @@
           </mc:Choice>
           <mc:Fallback>
             <w:pict>
-              <v:shape w14:anchorId="1404F061" id="Graphic 7" o:spid="_x0000_s1026" style="position:absolute;margin-left:76.85pt;margin-top:.5pt;width:3.75pt;height:25.6pt;z-index:251642368;visibility:visible;mso-wrap-style:square;mso-wrap-distance-left:0;mso-wrap-distance-top:0;mso-wrap-distance-right:0;mso-wrap-distance-bottom:0;mso-position-horizontal:absolute;mso-position-horizontal-relative:page;mso-position-vertical:absolute;mso-position-vertical-relative:text;v-text-anchor:top" coordsize="47625,325120" o:gfxdata="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" path="m47625,325120l,325120,,,47625,r,325120xe" fillcolor="#2b5282" stroked="f">
+              <v:shape w14:anchorId="67D5F7AF" id="Graphic 7" o:spid="_x0000_s1026" style="position:absolute;margin-left:76.85pt;margin-top:.5pt;width:3.75pt;height:25.6pt;z-index:251642368;visibility:visible;mso-wrap-style:square;mso-wrap-distance-left:0;mso-wrap-distance-top:0;mso-wrap-distance-right:0;mso-wrap-distance-bottom:0;mso-position-horizontal:absolute;mso-position-horizontal-relative:page;mso-position-vertical:absolute;mso-position-vertical-relative:text;v-text-anchor:top" coordsize="47625,325120" o:gfxdata="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" path="m47625,325120l,325120,,,47625,r,325120xe" fillcolor="#2b5282" stroked="f">
                 <v:path arrowok="t"/>
                 <w10:wrap anchorx="page"/>
               </v:shape>
@@ -11001,7 +11001,7 @@
           </mc:Choice>
           <mc:Fallback>
             <w:pict>
-              <v:shape w14:anchorId="3D30FFD7" id="Graphic 8" o:spid="_x0000_s1026" style="position:absolute;margin-left:76.85pt;margin-top:-3.05pt;width:3.75pt;height:25.6pt;z-index:251645440;visibility:visible;mso-wrap-style:square;mso-wrap-distance-left:0;mso-wrap-distance-top:0;mso-wrap-distance-right:0;mso-wrap-distance-bottom:0;mso-position-horizontal:absolute;mso-position-horizontal-relative:page;mso-position-vertical:absolute;mso-position-vertical-relative:text;v-text-anchor:top" coordsize="47625,325120" o:gfxdata="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" path="m47625,325120l,325120,,,47625,r,325120xe" fillcolor="#2b5282" stroked="f">
+              <v:shape w14:anchorId="246C56E5" id="Graphic 8" o:spid="_x0000_s1026" style="position:absolute;margin-left:76.85pt;margin-top:-3.05pt;width:3.75pt;height:25.6pt;z-index:251645440;visibility:visible;mso-wrap-style:square;mso-wrap-distance-left:0;mso-wrap-distance-top:0;mso-wrap-distance-right:0;mso-wrap-distance-bottom:0;mso-position-horizontal:absolute;mso-position-horizontal-relative:page;mso-position-vertical:absolute;mso-position-vertical-relative:text;v-text-anchor:top" coordsize="47625,325120" o:gfxdata="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" path="m47625,325120l,325120,,,47625,r,325120xe" fillcolor="#2b5282" stroked="f">
                 <v:path arrowok="t"/>
                 <w10:wrap anchorx="page"/>
               </v:shape>
@@ -13213,7 +13213,7 @@
           </mc:Choice>
           <mc:Fallback>
             <w:pict>
-              <v:shape w14:anchorId="3C405B29" id="Graphic 9" o:spid="_x0000_s1026" style="position:absolute;margin-left:76.85pt;margin-top:.5pt;width:3.75pt;height:25.6pt;z-index:251648512;visibility:visible;mso-wrap-style:square;mso-wrap-distance-left:0;mso-wrap-distance-top:0;mso-wrap-distance-right:0;mso-wrap-distance-bottom:0;mso-position-horizontal:absolute;mso-position-horizontal-relative:page;mso-position-vertical:absolute;mso-position-vertical-relative:text;v-text-anchor:top" coordsize="47625,325120" o:gfxdata="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" path="m47625,325120l,325120,,,47625,r,325120xe" fillcolor="#2b5282" stroked="f">
+              <v:shape w14:anchorId="1224147C" id="Graphic 9" o:spid="_x0000_s1026" style="position:absolute;margin-left:76.85pt;margin-top:.5pt;width:3.75pt;height:25.6pt;z-index:251648512;visibility:visible;mso-wrap-style:square;mso-wrap-distance-left:0;mso-wrap-distance-top:0;mso-wrap-distance-right:0;mso-wrap-distance-bottom:0;mso-position-horizontal:absolute;mso-position-horizontal-relative:page;mso-position-vertical:absolute;mso-position-vertical-relative:text;v-text-anchor:top" coordsize="47625,325120" o:gfxdata="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" path="m47625,325120l,325120,,,47625,r,325120xe" fillcolor="#2b5282" stroked="f">
                 <v:path arrowok="t"/>
                 <w10:wrap anchorx="page"/>
               </v:shape>
@@ -14341,7 +14341,7 @@
           </mc:Choice>
           <mc:Fallback>
             <w:pict>
-              <v:shape w14:anchorId="4F647029" id="Graphic 10" o:spid="_x0000_s1026" style="position:absolute;margin-left:76.85pt;margin-top:-3.05pt;width:3.75pt;height:25.6pt;z-index:251651584;visibility:visible;mso-wrap-style:square;mso-wrap-distance-left:0;mso-wrap-distance-top:0;mso-wrap-distance-right:0;mso-wrap-distance-bottom:0;mso-position-horizontal:absolute;mso-position-horizontal-relative:page;mso-position-vertical:absolute;mso-position-vertical-relative:text;v-text-anchor:top" coordsize="47625,325120" o:gfxdata="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" path="m47625,325120l,325120,,,47625,r,325120xe" fillcolor="#2b5282" stroked="f">
+              <v:shape w14:anchorId="60972B54" id="Graphic 10" o:spid="_x0000_s1026" style="position:absolute;margin-left:76.85pt;margin-top:-3.05pt;width:3.75pt;height:25.6pt;z-index:251651584;visibility:visible;mso-wrap-style:square;mso-wrap-distance-left:0;mso-wrap-distance-top:0;mso-wrap-distance-right:0;mso-wrap-distance-bottom:0;mso-position-horizontal:absolute;mso-position-horizontal-relative:page;mso-position-vertical:absolute;mso-position-vertical-relative:text;v-text-anchor:top" coordsize="47625,325120" o:gfxdata="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" path="m47625,325120l,325120,,,47625,r,325120xe" fillcolor="#2b5282" stroked="f">
                 <v:path arrowok="t"/>
                 <w10:wrap anchorx="page"/>
               </v:shape>
@@ -14792,7 +14792,7 @@
           </mc:Choice>
           <mc:Fallback>
             <w:pict>
-              <v:shape w14:anchorId="3713C854" id="Graphic 11" o:spid="_x0000_s1026" style="position:absolute;margin-left:76.85pt;margin-top:-3.05pt;width:3.75pt;height:25.6pt;z-index:251654656;visibility:visible;mso-wrap-style:square;mso-wrap-distance-left:0;mso-wrap-distance-top:0;mso-wrap-distance-right:0;mso-wrap-distance-bottom:0;mso-position-horizontal:absolute;mso-position-horizontal-relative:page;mso-position-vertical:absolute;mso-position-vertical-relative:text;v-text-anchor:top" coordsize="47625,325120" o:gfxdata="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" path="m47625,325120l,325120,,,47625,r,325120xe" fillcolor="#2b5282" stroked="f">
+              <v:shape w14:anchorId="4FAACB01" id="Graphic 11" o:spid="_x0000_s1026" style="position:absolute;margin-left:76.85pt;margin-top:-3.05pt;width:3.75pt;height:25.6pt;z-index:251654656;visibility:visible;mso-wrap-style:square;mso-wrap-distance-left:0;mso-wrap-distance-top:0;mso-wrap-distance-right:0;mso-wrap-distance-bottom:0;mso-position-horizontal:absolute;mso-position-horizontal-relative:page;mso-position-vertical:absolute;mso-position-vertical-relative:text;v-text-anchor:top" coordsize="47625,325120" o:gfxdata="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" path="m47625,325120l,325120,,,47625,r,325120xe" fillcolor="#2b5282" stroked="f">
                 <v:path arrowok="t"/>
                 <w10:wrap anchorx="page"/>
               </v:shape>
@@ -16821,7 +16821,7 @@
           </mc:Choice>
           <mc:Fallback>
             <w:pict>
-              <v:shape w14:anchorId="44BAC830" id="Graphic 12" o:spid="_x0000_s1026" style="position:absolute;margin-left:76.85pt;margin-top:.5pt;width:3.75pt;height:25.6pt;z-index:251657728;visibility:visible;mso-wrap-style:square;mso-wrap-distance-left:0;mso-wrap-distance-top:0;mso-wrap-distance-right:0;mso-wrap-distance-bottom:0;mso-position-horizontal:absolute;mso-position-horizontal-relative:page;mso-position-vertical:absolute;mso-position-vertical-relative:text;v-text-anchor:top" coordsize="47625,325120" o:gfxdata="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" path="m47625,325120l,325120,,,47625,r,325120xe" fillcolor="#2b5282" stroked="f">
+              <v:shape w14:anchorId="5DBA5B31" id="Graphic 12" o:spid="_x0000_s1026" style="position:absolute;margin-left:76.85pt;margin-top:.5pt;width:3.75pt;height:25.6pt;z-index:251657728;visibility:visible;mso-wrap-style:square;mso-wrap-distance-left:0;mso-wrap-distance-top:0;mso-wrap-distance-right:0;mso-wrap-distance-bottom:0;mso-position-horizontal:absolute;mso-position-horizontal-relative:page;mso-position-vertical:absolute;mso-position-vertical-relative:text;v-text-anchor:top" coordsize="47625,325120" o:gfxdata="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" path="m47625,325120l,325120,,,47625,r,325120xe" fillcolor="#2b5282" stroked="f">
                 <v:path arrowok="t"/>
                 <w10:wrap anchorx="page"/>
               </v:shape>
@@ -17705,7 +17705,7 @@
           </mc:Choice>
           <mc:Fallback>
             <w:pict>
-              <v:shape w14:anchorId="22201CE5" id="Graphic 13" o:spid="_x0000_s1026" style="position:absolute;margin-left:76.85pt;margin-top:-3.05pt;width:3.75pt;height:25.6pt;z-index:251660800;visibility:visible;mso-wrap-style:square;mso-wrap-distance-left:0;mso-wrap-distance-top:0;mso-wrap-distance-right:0;mso-wrap-distance-bottom:0;mso-position-horizontal:absolute;mso-position-horizontal-relative:page;mso-position-vertical:absolute;mso-position-vertical-relative:text;v-text-anchor:top" coordsize="47625,325120" o:gfxdata="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" path="m47625,325120l,325120,,,47625,r,325120xe" fillcolor="#2b5282" stroked="f">
+              <v:shape w14:anchorId="4E990FA6" id="Graphic 13" o:spid="_x0000_s1026" style="position:absolute;margin-left:76.85pt;margin-top:-3.05pt;width:3.75pt;height:25.6pt;z-index:251660800;visibility:visible;mso-wrap-style:square;mso-wrap-distance-left:0;mso-wrap-distance-top:0;mso-wrap-distance-right:0;mso-wrap-distance-bottom:0;mso-position-horizontal:absolute;mso-position-horizontal-relative:page;mso-position-vertical:absolute;mso-position-vertical-relative:text;v-text-anchor:top" coordsize="47625,325120" o:gfxdata="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" path="m47625,325120l,325120,,,47625,r,325120xe" fillcolor="#2b5282" stroked="f">
                 <v:path arrowok="t"/>
                 <w10:wrap anchorx="page"/>
               </v:shape>
@@ -18756,7 +18756,7 @@
           </mc:Choice>
           <mc:Fallback>
             <w:pict>
-              <v:shape w14:anchorId="46723CE6" id="Graphic 14" o:spid="_x0000_s1026" style="position:absolute;margin-left:76.85pt;margin-top:-3.05pt;width:3.75pt;height:25.6pt;z-index:251663872;visibility:visible;mso-wrap-style:square;mso-wrap-distance-left:0;mso-wrap-distance-top:0;mso-wrap-distance-right:0;mso-wrap-distance-bottom:0;mso-position-horizontal:absolute;mso-position-horizontal-relative:page;mso-position-vertical:absolute;mso-position-vertical-relative:text;v-text-anchor:top" coordsize="47625,325120" o:gfxdata="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" path="m47625,325120l,325120,,,47625,r,325120xe" fillcolor="#2b5282" stroked="f">
+              <v:shape w14:anchorId="13A5816C" id="Graphic 14" o:spid="_x0000_s1026" style="position:absolute;margin-left:76.85pt;margin-top:-3.05pt;width:3.75pt;height:25.6pt;z-index:251663872;visibility:visible;mso-wrap-style:square;mso-wrap-distance-left:0;mso-wrap-distance-top:0;mso-wrap-distance-right:0;mso-wrap-distance-bottom:0;mso-position-horizontal:absolute;mso-position-horizontal-relative:page;mso-position-vertical:absolute;mso-position-vertical-relative:text;v-text-anchor:top" coordsize="47625,325120" o:gfxdata="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" path="m47625,325120l,325120,,,47625,r,325120xe" fillcolor="#2b5282" stroked="f">
                 <v:path arrowok="t"/>
                 <w10:wrap anchorx="page"/>
               </v:shape>
@@ -19828,7 +19828,7 @@
           </mc:Choice>
           <mc:Fallback>
             <w:pict>
-              <v:shape w14:anchorId="7F97BC9E" id="Graphic 15" o:spid="_x0000_s1026" style="position:absolute;margin-left:76.85pt;margin-top:.5pt;width:3.75pt;height:25.6pt;z-index:251666944;visibility:visible;mso-wrap-style:square;mso-wrap-distance-left:0;mso-wrap-distance-top:0;mso-wrap-distance-right:0;mso-wrap-distance-bottom:0;mso-position-horizontal:absolute;mso-position-horizontal-relative:page;mso-position-vertical:absolute;mso-position-vertical-relative:text;v-text-anchor:top" coordsize="47625,325120" o:gfxdata="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" path="m47625,325120l,325120,,,47625,r,325120xe" fillcolor="#2b5282" stroked="f">
+              <v:shape w14:anchorId="4EC368FA" id="Graphic 15" o:spid="_x0000_s1026" style="position:absolute;margin-left:76.85pt;margin-top:.5pt;width:3.75pt;height:25.6pt;z-index:251666944;visibility:visible;mso-wrap-style:square;mso-wrap-distance-left:0;mso-wrap-distance-top:0;mso-wrap-distance-right:0;mso-wrap-distance-bottom:0;mso-position-horizontal:absolute;mso-position-horizontal-relative:page;mso-position-vertical:absolute;mso-position-vertical-relative:text;v-text-anchor:top" coordsize="47625,325120" o:gfxdata="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" path="m47625,325120l,325120,,,47625,r,325120xe" fillcolor="#2b5282" stroked="f">
                 <v:path arrowok="t"/>
                 <w10:wrap anchorx="page"/>
               </v:shape>
@@ -21472,7 +21472,7 @@
           </mc:Choice>
           <mc:Fallback>
             <w:pict>
-              <v:shape w14:anchorId="2049C6F5" id="Graphic 16" o:spid="_x0000_s1026" style="position:absolute;margin-left:76.85pt;margin-top:-3.05pt;width:3.75pt;height:25.6pt;z-index:251670016;visibility:visible;mso-wrap-style:square;mso-wrap-distance-left:0;mso-wrap-distance-top:0;mso-wrap-distance-right:0;mso-wrap-distance-bottom:0;mso-position-horizontal:absolute;mso-position-horizontal-relative:page;mso-position-vertical:absolute;mso-position-vertical-relative:text;v-text-anchor:top" coordsize="47625,325120" o:gfxdata="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" path="m47625,325120l,325120,,,47625,r,325120xe" fillcolor="#2b5282" stroked="f">
+              <v:shape w14:anchorId="76876170" id="Graphic 16" o:spid="_x0000_s1026" style="position:absolute;margin-left:76.85pt;margin-top:-3.05pt;width:3.75pt;height:25.6pt;z-index:251670016;visibility:visible;mso-wrap-style:square;mso-wrap-distance-left:0;mso-wrap-distance-top:0;mso-wrap-distance-right:0;mso-wrap-distance-bottom:0;mso-position-horizontal:absolute;mso-position-horizontal-relative:page;mso-position-vertical:absolute;mso-position-vertical-relative:text;v-text-anchor:top" coordsize="47625,325120" o:gfxdata="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" path="m47625,325120l,325120,,,47625,r,325120xe" fillcolor="#2b5282" stroked="f">
                 <v:path arrowok="t"/>
                 <w10:wrap anchorx="page"/>
               </v:shape>
@@ -21719,7 +21719,7 @@
           </mc:Choice>
           <mc:Fallback>
             <w:pict>
-              <v:shape w14:anchorId="0A4559E8" id="Graphic 21" o:spid="_x0000_s1026" style="position:absolute;margin-left:76.85pt;margin-top:-3.05pt;width:3.75pt;height:25.6pt;z-index:251674112;visibility:visible;mso-wrap-style:square;mso-wrap-distance-left:0;mso-wrap-distance-top:0;mso-wrap-distance-right:0;mso-wrap-distance-bottom:0;mso-position-horizontal:absolute;mso-position-horizontal-relative:page;mso-position-vertical:absolute;mso-position-vertical-relative:text;v-text-anchor:top" coordsize="47625,325120" o:gfxdata="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" path="m47625,325120l,325120,,,47625,r,325120xe" fillcolor="#2b5282" stroked="f">
+              <v:shape w14:anchorId="462CE0C2" id="Graphic 21" o:spid="_x0000_s1026" style="position:absolute;margin-left:76.85pt;margin-top:-3.05pt;width:3.75pt;height:25.6pt;z-index:251674112;visibility:visible;mso-wrap-style:square;mso-wrap-distance-left:0;mso-wrap-distance-top:0;mso-wrap-distance-right:0;mso-wrap-distance-bottom:0;mso-position-horizontal:absolute;mso-position-horizontal-relative:page;mso-position-vertical:absolute;mso-position-vertical-relative:text;v-text-anchor:top" coordsize="47625,325120" o:gfxdata="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" path="m47625,325120l,325120,,,47625,r,325120xe" fillcolor="#2b5282" stroked="f">
                 <v:path arrowok="t"/>
                 <w10:wrap anchorx="page"/>
               </v:shape>

</xml_diff>